<commit_message>
Docs: hướng dẫn sử dụng biểu mẫu thêm ký tay + QR, xuất zip, đổi mật khẩu
Co-Authored-By: Claude Opus 5.5 <noreply@anthropic.com>
Claude-Session: https://claude.ai/code/session_01B8Rkooox8g3rEYiJN8iSsz
</commit_message>
<xml_diff>
--- a/Docs/Huong-dan-su-dung-Bieu-mau-kiem-soat.docx
+++ b/Docs/Huong-dan-su-dung-Bieu-mau-kiem-soat.docx
@@ -1853,7 +1853,7 @@
         <w:t xml:space="preserve">Hoàn thành</w:t>
       </w:r>
       <w:r>
-        <w:t xml:space="preserve"> → xác nhận. Phiếu được chốt, sau đó </w:t>
+        <w:t xml:space="preserve"> → ký tay vào khung bằng ngón tay → Ký &amp; Hoàn thành (mục 8). Phiếu được chốt, sau đó </w:t>
       </w:r>
       <w:r>
         <w:rPr>
@@ -2200,7 +2200,7 @@
         <w:t xml:space="preserve">Hoàn thành</w:t>
       </w:r>
       <w:r>
-        <w:t xml:space="preserve"> (có xác nhận). Phiếu đã lưu có thêm nút </w:t>
+        <w:t xml:space="preserve"> (nút Ký &amp; Hoàn thành: ký bằng chuột vào khung, xem mục 8). Phiếu đã lưu có thêm nút </w:t>
       </w:r>
       <w:r>
         <w:rPr>
@@ -2376,7 +2376,7 @@
         <w:t xml:space="preserve">Trên web — Kiểm soát ATTP → Phiếu ghi nhận:</w:t>
       </w:r>
       <w:r>
-        <w:t xml:space="preserve"> lọc theo mẫu/ngày; mỗi phiếu có trạng thái, nút </w:t>
+        <w:t xml:space="preserve"> lọc theo biểu mẫu và khoảng Từ ngày – Đến ngày, xuất cả loạt ra .zip (mục 9); mỗi phiếu có trạng thái, nút </w:t>
       </w:r>
       <w:r>
         <w:rPr>
@@ -2570,7 +2570,7 @@
         <w:t xml:space="preserve">QC thẩm tra</w:t>
       </w:r>
       <w:r>
-        <w:t xml:space="preserve"> ở chân trang.</w:t>
+        <w:t xml:space="preserve"> ở chân trang; phiếu đã ký có thêm khối Người lập &amp; ký và mã QR đối chiếu (mục 8).</w:t>
       </w:r>
     </w:p>
     <w:p>
@@ -2599,7 +2599,537 @@
         <w:pStyle w:val="Heading2"/>
       </w:pPr>
       <w:r>
-        <w:t xml:space="preserve">8. Tình huống thường gặp</w:t>
+        <w:t xml:space="preserve">8. Ký xác nhận và mã QR đối chiếu bản gốc</w:t>
+      </w:r>
+    </w:p>
+    <w:p>
+      <w:pPr/>
+      <w:r>
+        <w:t xml:space="preserve">Mỗi phiếu khi </w:t>
+      </w:r>
+      <w:r>
+        <w:rPr>
+          <w:b/>
+        </w:rPr>
+        <w:t xml:space="preserve">Hoàn thành</w:t>
+      </w:r>
+      <w:r>
+        <w:t xml:space="preserve"> phải được người nhập </w:t>
+      </w:r>
+      <w:r>
+        <w:rPr>
+          <w:b/>
+        </w:rPr>
+        <w:t xml:space="preserve">ký tay</w:t>
+      </w:r>
+      <w:r>
+        <w:t xml:space="preserve">, để hồ sơ gửi đoàn kiểm tra có người chịu trách nhiệm và chứng minh được không bị sửa sau khi ký.</w:t>
+      </w:r>
+    </w:p>
+    <w:p>
+      <w:pPr>
+        <w:pStyle w:val="ListParagraph"/>
+        <w:numPr>
+          <w:ilvl w:val="0"/>
+          <w:numId w:val="14"/>
+        </w:numPr>
+      </w:pPr>
+      <w:r>
+        <w:t xml:space="preserve">Bấm </w:t>
+      </w:r>
+      <w:r>
+        <w:rPr>
+          <w:b/>
+        </w:rPr>
+        <w:t xml:space="preserve">Hoàn thành</w:t>
+      </w:r>
+      <w:r>
+        <w:t xml:space="preserve"> (app) hoặc </w:t>
+      </w:r>
+      <w:r>
+        <w:rPr>
+          <w:b/>
+        </w:rPr>
+        <w:t xml:space="preserve">Ký &amp; Hoàn thành</w:t>
+      </w:r>
+      <w:r>
+        <w:t xml:space="preserve"> (web) → hiện khung ký.</w:t>
+      </w:r>
+    </w:p>
+    <w:p>
+      <w:pPr>
+        <w:pStyle w:val="ListParagraph"/>
+        <w:numPr>
+          <w:ilvl w:val="0"/>
+          <w:numId w:val="14"/>
+        </w:numPr>
+      </w:pPr>
+      <w:r>
+        <w:t xml:space="preserve">Ký vào khung: trên điện thoại ký bằng </w:t>
+      </w:r>
+      <w:r>
+        <w:rPr>
+          <w:b/>
+        </w:rPr>
+        <w:t xml:space="preserve">ngón tay</w:t>
+      </w:r>
+      <w:r>
+        <w:t xml:space="preserve">, trên máy tính ký bằng </w:t>
+      </w:r>
+      <w:r>
+        <w:rPr>
+          <w:b/>
+        </w:rPr>
+        <w:t xml:space="preserve">chuột</w:t>
+      </w:r>
+      <w:r>
+        <w:t xml:space="preserve"> (giữ chuột trái và kéo). Ký xấu thì bấm </w:t>
+      </w:r>
+      <w:r>
+        <w:rPr>
+          <w:b/>
+        </w:rPr>
+        <w:t xml:space="preserve">Ký lại</w:t>
+      </w:r>
+      <w:r>
+        <w:t xml:space="preserve">.</w:t>
+      </w:r>
+    </w:p>
+    <w:p>
+      <w:pPr>
+        <w:pStyle w:val="ListParagraph"/>
+        <w:numPr>
+          <w:ilvl w:val="0"/>
+          <w:numId w:val="14"/>
+        </w:numPr>
+      </w:pPr>
+      <w:r>
+        <w:t xml:space="preserve">Bấm </w:t>
+      </w:r>
+      <w:r>
+        <w:rPr>
+          <w:b/>
+        </w:rPr>
+        <w:t xml:space="preserve">Ký &amp; Hoàn thành</w:t>
+      </w:r>
+      <w:r>
+        <w:t xml:space="preserve">. Chưa ký thì không chốt được phiếu.</w:t>
+      </w:r>
+    </w:p>
+    <w:p>
+      <w:pPr/>
+      <w:r>
+        <w:t xml:space="preserve">Hệ thống lưu kèm phiếu: người ký, giờ ký, hình chữ ký và </w:t>
+      </w:r>
+      <w:r>
+        <w:rPr>
+          <w:b/>
+        </w:rPr>
+        <w:t xml:space="preserve">mã xác thực</w:t>
+      </w:r>
+      <w:r>
+        <w:t xml:space="preserve"> (dấu vân tay của toàn bộ nội dung phiếu lúc ký). File PDF của phiếu có thêm:</w:t>
+      </w:r>
+    </w:p>
+    <w:p>
+      <w:pPr>
+        <w:pStyle w:val="ListParagraph"/>
+        <w:numPr>
+          <w:ilvl w:val="0"/>
+          <w:numId w:val="15"/>
+        </w:numPr>
+      </w:pPr>
+      <w:r>
+        <w:t xml:space="preserve">Khối </w:t>
+      </w:r>
+      <w:r>
+        <w:rPr>
+          <w:b/>
+        </w:rPr>
+        <w:t xml:space="preserve">Người lập &amp; ký</w:t>
+      </w:r>
+      <w:r>
+        <w:t xml:space="preserve">: tên, "Ký điện tử lúc …", hình chữ ký.</w:t>
+      </w:r>
+    </w:p>
+    <w:p>
+      <w:pPr>
+        <w:pStyle w:val="ListParagraph"/>
+        <w:numPr>
+          <w:ilvl w:val="0"/>
+          <w:numId w:val="15"/>
+        </w:numPr>
+      </w:pPr>
+      <w:r>
+        <w:rPr>
+          <w:b/>
+        </w:rPr>
+        <w:t xml:space="preserve">Mã QR</w:t>
+      </w:r>
+      <w:r>
+        <w:t xml:space="preserve"> "Quét mã để đối chiếu bản gốc" kèm mã xác thực.</w:t>
+      </w:r>
+    </w:p>
+    <w:p>
+      <w:pPr/>
+      <w:r>
+        <w:t xml:space="preserve">Cán bộ kiểm tra dùng điện thoại quét mã QR → mở trang đối chiếu (không cần tài khoản) xem nội dung phiếu, người ký, giờ ký, chữ ký và kết quả:</w:t>
+      </w:r>
+    </w:p>
+    <w:tbl>
+      <w:tblPr>
+        <w:tblStyle w:val="TableGrid"/>
+        <w:tblW w:w="0" w:type="auto"/>
+        <w:tblLayout w:type="fixed"/>
+        <w:tblLook w:val="04A0" w:firstRow="1" w:lastRow="0" w:firstColumn="0" w:lastColumn="0" w:noHBand="0" w:noVBand="1"/>
+      </w:tblPr>
+      <w:tblGrid>
+        <w:gridCol w:w="4680"/>
+        <w:gridCol w:w="4680"/>
+      </w:tblGrid>
+      <w:tr>
+        <w:trPr>
+          <w:tblHeader/>
+        </w:trPr>
+        <w:tc>
+          <w:tcPr>
+            <w:tcW w:w="4680" w:type="dxa"/>
+            <w:shd w:val="clear" w:color="auto" w:fill="F2F2F2"/>
+          </w:tcPr>
+          <w:p>
+            <w:pPr/>
+            <w:r>
+              <w:t xml:space="preserve">Trang đối chiếu báo</w:t>
+            </w:r>
+          </w:p>
+        </w:tc>
+        <w:tc>
+          <w:tcPr>
+            <w:tcW w:w="4680" w:type="dxa"/>
+            <w:shd w:val="clear" w:color="auto" w:fill="F2F2F2"/>
+          </w:tcPr>
+          <w:p>
+            <w:pPr/>
+            <w:r>
+              <w:t xml:space="preserve">Ý nghĩa</w:t>
+            </w:r>
+          </w:p>
+        </w:tc>
+      </w:tr>
+      <w:tr>
+        <w:tc>
+          <w:tcPr>
+            <w:tcW w:w="4680" w:type="dxa"/>
+          </w:tcPr>
+          <w:p>
+            <w:pPr/>
+            <w:r>
+              <w:t xml:space="preserve">✓ Nội dung khớp với bản đã ký</w:t>
+            </w:r>
+          </w:p>
+        </w:tc>
+        <w:tc>
+          <w:tcPr>
+            <w:tcW w:w="4680" w:type="dxa"/>
+          </w:tcPr>
+          <w:p>
+            <w:pPr/>
+            <w:r>
+              <w:t xml:space="preserve">Dữ liệu phiếu không bị thay đổi kể từ lúc ký</w:t>
+            </w:r>
+          </w:p>
+        </w:tc>
+      </w:tr>
+      <w:tr>
+        <w:tc>
+          <w:tcPr>
+            <w:tcW w:w="4680" w:type="dxa"/>
+          </w:tcPr>
+          <w:p>
+            <w:pPr/>
+            <w:r>
+              <w:t xml:space="preserve">⚠ Nội dung KHÔNG khớp với bản đã ký</w:t>
+            </w:r>
+          </w:p>
+        </w:tc>
+        <w:tc>
+          <w:tcPr>
+            <w:tcW w:w="4680" w:type="dxa"/>
+          </w:tcPr>
+          <w:p>
+            <w:pPr/>
+            <w:r>
+              <w:t xml:space="preserve">Dữ liệu đã bị thay đổi sau khi ký - cần đối chiếu với cơ sở</w:t>
+            </w:r>
+          </w:p>
+        </w:tc>
+      </w:tr>
+      <w:tr>
+        <w:tc>
+          <w:tcPr>
+            <w:tcW w:w="4680" w:type="dxa"/>
+          </w:tcPr>
+          <w:p>
+            <w:pPr/>
+            <w:r>
+              <w:t xml:space="preserve">Phiếu này chưa được ký</w:t>
+            </w:r>
+          </w:p>
+        </w:tc>
+        <w:tc>
+          <w:tcPr>
+            <w:tcW w:w="4680" w:type="dxa"/>
+          </w:tcPr>
+          <w:p>
+            <w:pPr/>
+            <w:r>
+              <w:t xml:space="preserve">Phiếu đang nhập dở, hoặc hoàn thành trước khi có chức năng ký</w:t>
+            </w:r>
+          </w:p>
+        </w:tc>
+      </w:tr>
+    </w:tbl>
+    <w:p>
+      <w:pPr/>
+      <w:r>
+        <w:t xml:space="preserve">Đây là </w:t>
+      </w:r>
+      <w:r>
+        <w:rPr>
+          <w:b/>
+        </w:rPr>
+        <w:t xml:space="preserve">chữ ký điện tử</w:t>
+      </w:r>
+      <w:r>
+        <w:t xml:space="preserve"> trên phần mềm. Với hồ sơ gửi cơ quan cần giá trị pháp lý cao nhất, có thể ký thêm file PDF bằng </w:t>
+      </w:r>
+      <w:r>
+        <w:rPr>
+          <w:b/>
+        </w:rPr>
+        <w:t xml:space="preserve">chữ ký số (USB token)</w:t>
+      </w:r>
+      <w:r>
+        <w:t xml:space="preserve"> của công ty.</w:t>
+      </w:r>
+    </w:p>
+    <w:p>
+      <w:pPr>
+        <w:pStyle w:val="Heading2"/>
+      </w:pPr>
+      <w:r>
+        <w:t xml:space="preserve">9. Xuất PDF hàng loạt (.zip)</w:t>
+      </w:r>
+    </w:p>
+    <w:p>
+      <w:pPr/>
+      <w:r>
+        <w:t xml:space="preserve">Dùng khi cần nộp nhiều phiếu một lúc (ví dụ cả tháng cho đoàn kiểm tra). Web, menu </w:t>
+      </w:r>
+      <w:r>
+        <w:rPr>
+          <w:b/>
+        </w:rPr>
+        <w:t xml:space="preserve">Kiểm soát ATTP → Phiếu ghi nhận</w:t>
+      </w:r>
+      <w:r>
+        <w:t xml:space="preserve">:</w:t>
+      </w:r>
+    </w:p>
+    <w:p>
+      <w:pPr>
+        <w:pStyle w:val="ListParagraph"/>
+        <w:numPr>
+          <w:ilvl w:val="0"/>
+          <w:numId w:val="16"/>
+        </w:numPr>
+      </w:pPr>
+      <w:r>
+        <w:t xml:space="preserve">Chọn </w:t>
+      </w:r>
+      <w:r>
+        <w:rPr>
+          <w:b/>
+        </w:rPr>
+        <w:t xml:space="preserve">Biểu mẫu</w:t>
+      </w:r>
+      <w:r>
+        <w:t xml:space="preserve"> (hoặc để trống = mọi mẫu) và khoảng </w:t>
+      </w:r>
+      <w:r>
+        <w:rPr>
+          <w:b/>
+        </w:rPr>
+        <w:t xml:space="preserve">Từ ngày – Đến ngày</w:t>
+      </w:r>
+      <w:r>
+        <w:t xml:space="preserve">.</w:t>
+      </w:r>
+    </w:p>
+    <w:p>
+      <w:pPr>
+        <w:pStyle w:val="ListParagraph"/>
+        <w:numPr>
+          <w:ilvl w:val="0"/>
+          <w:numId w:val="16"/>
+        </w:numPr>
+      </w:pPr>
+      <w:r>
+        <w:t xml:space="preserve">Bảng hiện các phiếu khớp; nút </w:t>
+      </w:r>
+      <w:r>
+        <w:rPr>
+          <w:b/>
+        </w:rPr>
+        <w:t xml:space="preserve">Xuất PDF (.zip) – N phiếu</w:t>
+      </w:r>
+      <w:r>
+        <w:t xml:space="preserve"> cho biết số phiếu sẽ xuất.</w:t>
+      </w:r>
+    </w:p>
+    <w:p>
+      <w:pPr>
+        <w:pStyle w:val="ListParagraph"/>
+        <w:numPr>
+          <w:ilvl w:val="0"/>
+          <w:numId w:val="16"/>
+        </w:numPr>
+      </w:pPr>
+      <w:r>
+        <w:t xml:space="preserve">Bấm nút → tải về </w:t>
+      </w:r>
+      <w:r>
+        <w:rPr>
+          <w:b/>
+        </w:rPr>
+        <w:t xml:space="preserve">1 file .zip</w:t>
+      </w:r>
+      <w:r>
+        <w:t xml:space="preserve">, bên trong mỗi phiếu là </w:t>
+      </w:r>
+      <w:r>
+        <w:rPr>
+          <w:b/>
+        </w:rPr>
+        <w:t xml:space="preserve">1 file PDF</w:t>
+      </w:r>
+      <w:r>
+        <w:t xml:space="preserve"> (tên dạng </w:t>
+      </w:r>
+      <w:r>
+        <w:rPr>
+          <w:rStyle w:val="CodeChar"/>
+        </w:rPr>
+        <w:t xml:space="preserve">2026-10-05_BM-GMP.08-04_16.pdf</w:t>
+      </w:r>
+      <w:r>
+        <w:t xml:space="preserve">: ngày, mã hiệu, số phiếu).</w:t>
+      </w:r>
+    </w:p>
+    <w:p>
+      <w:pPr/>
+      <w:r>
+        <w:t xml:space="preserve">Mỗi lần xuất tối đa </w:t>
+      </w:r>
+      <w:r>
+        <w:rPr>
+          <w:b/>
+        </w:rPr>
+        <w:t xml:space="preserve">500 phiếu</w:t>
+      </w:r>
+      <w:r>
+        <w:t xml:space="preserve">; nhiều hơn thì thu hẹp khoảng ngày. Nhân viên nhập biểu mẫu chỉ xuất được phiếu của các mẫu mình được giao.</w:t>
+      </w:r>
+    </w:p>
+    <w:p>
+      <w:pPr>
+        <w:pStyle w:val="Heading2"/>
+      </w:pPr>
+      <w:r>
+        <w:t xml:space="preserve">10. Đổi mật khẩu</w:t>
+      </w:r>
+    </w:p>
+    <w:p>
+      <w:pPr/>
+      <w:r>
+        <w:t xml:space="preserve">Mọi người dùng tự đổi được mật khẩu của mình:</w:t>
+      </w:r>
+    </w:p>
+    <w:p>
+      <w:pPr>
+        <w:pStyle w:val="ListParagraph"/>
+        <w:numPr>
+          <w:ilvl w:val="0"/>
+          <w:numId w:val="17"/>
+        </w:numPr>
+      </w:pPr>
+      <w:r>
+        <w:rPr>
+          <w:b/>
+        </w:rPr>
+        <w:t xml:space="preserve">Web:</w:t>
+      </w:r>
+      <w:r>
+        <w:t xml:space="preserve"> bấm nút 🔑 trên thanh trên cùng (cạnh Đăng xuất).</w:t>
+      </w:r>
+    </w:p>
+    <w:p>
+      <w:pPr>
+        <w:pStyle w:val="ListParagraph"/>
+        <w:numPr>
+          <w:ilvl w:val="0"/>
+          <w:numId w:val="17"/>
+        </w:numPr>
+      </w:pPr>
+      <w:r>
+        <w:rPr>
+          <w:b/>
+        </w:rPr>
+        <w:t xml:space="preserve">App:</w:t>
+      </w:r>
+      <w:r>
+        <w:t xml:space="preserve"> chạm biểu tượng tài khoản ở góc trên → </w:t>
+      </w:r>
+      <w:r>
+        <w:rPr>
+          <w:b/>
+        </w:rPr>
+        <w:t xml:space="preserve">Đổi mật khẩu</w:t>
+      </w:r>
+      <w:r>
+        <w:t xml:space="preserve">.</w:t>
+      </w:r>
+    </w:p>
+    <w:p>
+      <w:pPr/>
+      <w:r>
+        <w:t xml:space="preserve">Nhập mật khẩu hiện tại, mật khẩu mới (tối thiểu 8 ký tự, có chữ hoa, chữ thường, chữ số và ký tự đặc biệt) và nhập lại. Sau khi đổi, </w:t>
+      </w:r>
+      <w:r>
+        <w:rPr>
+          <w:b/>
+        </w:rPr>
+        <w:t xml:space="preserve">máy đang dùng vẫn đăng nhập</w:t>
+      </w:r>
+      <w:r>
+        <w:t xml:space="preserve">; các thiết bị khác phải đăng nhập lại bằng mật khẩu mới. Quên mật khẩu thì nhờ quản trị cơ sở đặt lại ở màn </w:t>
+      </w:r>
+      <w:r>
+        <w:rPr>
+          <w:b/>
+        </w:rPr>
+        <w:t xml:space="preserve">Nhân sự</w:t>
+      </w:r>
+      <w:r>
+        <w:t xml:space="preserve">.</w:t>
+      </w:r>
+    </w:p>
+    <w:p>
+      <w:pPr>
+        <w:pStyle w:val="Heading2"/>
+      </w:pPr>
+      <w:r>
+        <w:t xml:space="preserve">11. Tình huống thường gặp</w:t>
       </w:r>
     </w:p>
     <w:tbl>
@@ -2753,7 +3283,7 @@
           <w:p>
             <w:pPr/>
             <w:r>
-              <w:t xml:space="preserve">Phiếu đã chốt không sửa được; chỉ bấm Hoàn thành khi đã đủ mọi ca</w:t>
+              <w:t xml:space="preserve">Phiếu đã ký/chốt không sửa được; chỉ bấm Hoàn thành khi đã đủ mọi ca</w:t>
             </w:r>
           </w:p>
         </w:tc>
@@ -2854,6 +3384,88 @@
           <w:p>
             <w:pPr/>
             <w:r>
+              <w:t xml:space="preserve">Báo </w:t>
+            </w:r>
+            <w:r>
+              <w:rPr>
+                <w:i/>
+              </w:rPr>
+              <w:t xml:space="preserve">"Vui lòng ký vào khung trước khi hoàn thành"</w:t>
+            </w:r>
+          </w:p>
+        </w:tc>
+        <w:tc>
+          <w:tcPr>
+            <w:tcW w:w="3120" w:type="dxa"/>
+          </w:tcPr>
+          <w:p>
+            <w:pPr/>
+            <w:r>
+              <w:t xml:space="preserve">Chưa ký vào khung ký</w:t>
+            </w:r>
+          </w:p>
+        </w:tc>
+        <w:tc>
+          <w:tcPr>
+            <w:tcW w:w="3120" w:type="dxa"/>
+          </w:tcPr>
+          <w:p>
+            <w:pPr/>
+            <w:r>
+              <w:t xml:space="preserve">Ký vào khung (ngón tay / chuột) rồi bấm Ký &amp; Hoàn thành</w:t>
+            </w:r>
+          </w:p>
+        </w:tc>
+      </w:tr>
+      <w:tr>
+        <w:tc>
+          <w:tcPr>
+            <w:tcW w:w="3120" w:type="dxa"/>
+          </w:tcPr>
+          <w:p>
+            <w:pPr/>
+            <w:r>
+              <w:t xml:space="preserve">Quét QR báo </w:t>
+            </w:r>
+            <w:r>
+              <w:rPr>
+                <w:i/>
+              </w:rPr>
+              <w:t xml:space="preserve">"Nội dung KHÔNG khớp với bản đã ký"</w:t>
+            </w:r>
+          </w:p>
+        </w:tc>
+        <w:tc>
+          <w:tcPr>
+            <w:tcW w:w="3120" w:type="dxa"/>
+          </w:tcPr>
+          <w:p>
+            <w:pPr/>
+            <w:r>
+              <w:t xml:space="preserve">Dữ liệu phiếu đã bị thay đổi sau khi ký (bình thường phần mềm không cho sửa phiếu đã ký)</w:t>
+            </w:r>
+          </w:p>
+        </w:tc>
+        <w:tc>
+          <w:tcPr>
+            <w:tcW w:w="3120" w:type="dxa"/>
+          </w:tcPr>
+          <w:p>
+            <w:pPr/>
+            <w:r>
+              <w:t xml:space="preserve">Báo ngay quản trị cơ sở để kiểm tra</w:t>
+            </w:r>
+          </w:p>
+        </w:tc>
+      </w:tr>
+      <w:tr>
+        <w:tc>
+          <w:tcPr>
+            <w:tcW w:w="3120" w:type="dxa"/>
+          </w:tcPr>
+          <w:p>
+            <w:pPr/>
+            <w:r>
               <w:t xml:space="preserve">Nhân viên không thấy tab/menu Biểu mẫu</w:t>
             </w:r>
           </w:p>
@@ -3033,6 +3645,50 @@
           <w:p>
             <w:pPr/>
             <w:r>
+              <w:t xml:space="preserve">Nút </w:t>
+            </w:r>
+            <w:r>
+              <w:rPr>
+                <w:i/>
+              </w:rPr>
+              <w:t xml:space="preserve">Xuất PDF (.zip)</w:t>
+            </w:r>
+            <w:r>
+              <w:t xml:space="preserve"> bị mờ</w:t>
+            </w:r>
+          </w:p>
+        </w:tc>
+        <w:tc>
+          <w:tcPr>
+            <w:tcW w:w="3120" w:type="dxa"/>
+          </w:tcPr>
+          <w:p>
+            <w:pPr/>
+            <w:r>
+              <w:t xml:space="preserve">Bộ lọc không ra phiếu nào, hoặc ra quá 500 phiếu</w:t>
+            </w:r>
+          </w:p>
+        </w:tc>
+        <w:tc>
+          <w:tcPr>
+            <w:tcW w:w="3120" w:type="dxa"/>
+          </w:tcPr>
+          <w:p>
+            <w:pPr/>
+            <w:r>
+              <w:t xml:space="preserve">Đổi bộ lọc / thu hẹp khoảng ngày (mục 9)</w:t>
+            </w:r>
+          </w:p>
+        </w:tc>
+      </w:tr>
+      <w:tr>
+        <w:tc>
+          <w:tcPr>
+            <w:tcW w:w="3120" w:type="dxa"/>
+          </w:tcPr>
+          <w:p>
+            <w:pPr/>
+            <w:r>
               <w:t xml:space="preserve">PDF thiếu logo / ngày ban hành</w:t>
             </w:r>
           </w:p>
@@ -3068,7 +3724,42 @@
           <w:p>
             <w:pPr/>
             <w:r>
-              <w:t xml:space="preserve">App chưa có tính năng mới</w:t>
+              <w:t xml:space="preserve">Quên mật khẩu</w:t>
+            </w:r>
+          </w:p>
+        </w:tc>
+        <w:tc>
+          <w:tcPr>
+            <w:tcW w:w="3120" w:type="dxa"/>
+          </w:tcPr>
+          <w:p>
+            <w:pPr/>
+            <w:r>
+              <w:t xml:space="preserve">—</w:t>
+            </w:r>
+          </w:p>
+        </w:tc>
+        <w:tc>
+          <w:tcPr>
+            <w:tcW w:w="3120" w:type="dxa"/>
+          </w:tcPr>
+          <w:p>
+            <w:pPr/>
+            <w:r>
+              <w:t xml:space="preserve">Nhờ quản trị cơ sở đặt lại ở màn Nhân sự, rồi tự đổi lại (mục 10)</w:t>
+            </w:r>
+          </w:p>
+        </w:tc>
+      </w:tr>
+      <w:tr>
+        <w:tc>
+          <w:tcPr>
+            <w:tcW w:w="3120" w:type="dxa"/>
+          </w:tcPr>
+          <w:p>
+            <w:pPr/>
+            <w:r>
+              <w:t xml:space="preserve">App chưa có tính năng mới (ký tay, đổi mật khẩu…)</w:t>
             </w:r>
           </w:p>
         </w:tc>
@@ -3324,6 +4015,24 @@
     <w:abstractNumId w:val="0"/>
   </w:num>
   <w:num w:numId="13">
+    <w:abstractNumId w:val="0"/>
+  </w:num>
+  <w:num w:numId="14">
+    <w:abstractNumId w:val="1"/>
+    <w:lvlOverride w:ilvl="0">
+      <w:startOverride w:val="1"/>
+    </w:lvlOverride>
+  </w:num>
+  <w:num w:numId="15">
+    <w:abstractNumId w:val="0"/>
+  </w:num>
+  <w:num w:numId="16">
+    <w:abstractNumId w:val="1"/>
+    <w:lvlOverride w:ilvl="0">
+      <w:startOverride w:val="1"/>
+    </w:lvlOverride>
+  </w:num>
+  <w:num w:numId="17">
     <w:abstractNumId w:val="0"/>
   </w:num>
 </w:numbering>

</xml_diff>

<commit_message>
Docs: hướng dẫn + bàn giao cho chữ ký số máy chủ và QR tự đối chiếu PDF
Co-Authored-By: Claude Opus 5.5 <noreply@anthropic.com>
</commit_message>
<xml_diff>
--- a/Docs/Huong-dan-su-dung-Bieu-mau-kiem-soat.docx
+++ b/Docs/Huong-dan-su-dung-Bieu-mau-kiem-soat.docx
@@ -2728,7 +2728,7 @@
         <w:t xml:space="preserve">mã xác thực</w:t>
       </w:r>
       <w:r>
-        <w:t xml:space="preserve"> (dấu vân tay của toàn bộ nội dung phiếu lúc ký). File PDF của phiếu có thêm:</w:t>
+        <w:t xml:space="preserve"> (dấu vân tay của toàn bộ nội dung phiếu lúc ký), kèm chữ ký số của hệ thống bằng khoá riêng cất ngoài cơ sở dữ liệu - nên kể cả sửa thẳng trong cơ sở dữ liệu cũng bị phát hiện. File PDF của phiếu có thêm:</w:t>
       </w:r>
     </w:p>
     <w:p>
@@ -2824,7 +2824,7 @@
           <w:p>
             <w:pPr/>
             <w:r>
-              <w:t xml:space="preserve">✓ Nội dung khớp với bản đã ký</w:t>
+              <w:t xml:space="preserve">✓ Bản PDF này đúng là bản đã ký, dữ liệu trên hệ thống chưa bị thay đổi</w:t>
             </w:r>
           </w:p>
         </w:tc>
@@ -2835,7 +2835,7 @@
           <w:p>
             <w:pPr/>
             <w:r>
-              <w:t xml:space="preserve">Dữ liệu phiếu không bị thay đổi kể từ lúc ký</w:t>
+              <w:t xml:space="preserve">Đúng bản gốc. Chỉ cần so số liệu trên giấy với trang - khác nhau thì bản giấy đã bị sửa</w:t>
             </w:r>
           </w:p>
         </w:tc>
@@ -2848,7 +2848,7 @@
           <w:p>
             <w:pPr/>
             <w:r>
-              <w:t xml:space="preserve">⚠ Nội dung KHÔNG khớp với bản đã ký</w:t>
+              <w:t xml:space="preserve">⚠ Bản PDF bạn đang quét KHÔNG phải bản đang lưu trên hệ thống</w:t>
             </w:r>
           </w:p>
         </w:tc>
@@ -2859,7 +2859,7 @@
           <w:p>
             <w:pPr/>
             <w:r>
-              <w:t xml:space="preserve">Dữ liệu đã bị thay đổi sau khi ký - cần đối chiếu với cơ sở</w:t>
+              <w:t xml:space="preserve">Phiếu đã được sửa và ký lại sau khi in bản PDF này, hoặc PDF không do hệ thống tạo. Bản đúng là trang đối chiếu</w:t>
             </w:r>
           </w:p>
         </w:tc>
@@ -2872,6 +2872,30 @@
           <w:p>
             <w:pPr/>
             <w:r>
+              <w:t xml:space="preserve">⚠ Dữ liệu trên hệ thống đã bị thay đổi sau khi ký</w:t>
+            </w:r>
+          </w:p>
+        </w:tc>
+        <w:tc>
+          <w:tcPr>
+            <w:tcW w:w="4680" w:type="dxa"/>
+          </w:tcPr>
+          <w:p>
+            <w:pPr/>
+            <w:r>
+              <w:t xml:space="preserve">Dữ liệu bị sửa ngoài phần mềm (sai mã xác thực hoặc chữ ký số của hệ thống) - cần đối chiếu với cơ sở</w:t>
+            </w:r>
+          </w:p>
+        </w:tc>
+      </w:tr>
+      <w:tr>
+        <w:tc>
+          <w:tcPr>
+            <w:tcW w:w="4680" w:type="dxa"/>
+          </w:tcPr>
+          <w:p>
+            <w:pPr/>
+            <w:r>
               <w:t xml:space="preserve">Phiếu này chưa được ký</w:t>
             </w:r>
           </w:p>
@@ -2889,6 +2913,30 @@
         </w:tc>
       </w:tr>
     </w:tbl>
+    <w:p>
+      <w:pPr/>
+      <w:r>
+        <w:rPr>
+          <w:b/>
+        </w:rPr>
+        <w:t xml:space="preserve">Lưu ý: </w:t>
+      </w:r>
+      <w:r>
+        <w:t xml:space="preserve">trang đối chiếu tự so mã xác thực mang trong QR với bản lưu trên hệ thống, nhưng không đọc được chữ in trên tờ PDF/giấy. Vì vậy vẫn cần so số liệu, người ký, giờ ký trên giấy với trang; khác nhau nghĩa là bản giấy đã bị sửa - bản đúng là bản trên trang.</w:t>
+      </w:r>
+    </w:p>
+    <w:p>
+      <w:pPr>
+        <w:pStyle w:val="ListParagraph"/>
+        <w:numPr>
+          <w:ilvl w:val="0"/>
+          <w:numId w:val="15"/>
+        </w:numPr>
+      </w:pPr>
+      <w:r>
+        <w:t xml:space="preserve">PDF in trước ngày 09/10/2026 có QR chưa mang mã xác thực: trang chỉ báo "Dữ liệu trên hệ thống chưa bị thay đổi kể từ lúc ký", người kiểm tra tự so mã xác thực in cạnh QR với 12 ký tự in đậm trên trang. In lại PDF để có QR mới.</w:t>
+      </w:r>
+    </w:p>
     <w:p>
       <w:pPr/>
       <w:r>
@@ -3431,18 +3479,18 @@
               <w:rPr>
                 <w:i/>
               </w:rPr>
-              <w:t xml:space="preserve">"Nội dung KHÔNG khớp với bản đã ký"</w:t>
-            </w:r>
-          </w:p>
-        </w:tc>
-        <w:tc>
-          <w:tcPr>
-            <w:tcW w:w="3120" w:type="dxa"/>
-          </w:tcPr>
-          <w:p>
-            <w:pPr/>
-            <w:r>
-              <w:t xml:space="preserve">Dữ liệu phiếu đã bị thay đổi sau khi ký (bình thường phần mềm không cho sửa phiếu đã ký)</w:t>
+              <w:t xml:space="preserve">"Dữ liệu trên hệ thống đã bị thay đổi sau khi ký"</w:t>
+            </w:r>
+          </w:p>
+        </w:tc>
+        <w:tc>
+          <w:tcPr>
+            <w:tcW w:w="3120" w:type="dxa"/>
+          </w:tcPr>
+          <w:p>
+            <w:pPr/>
+            <w:r>
+              <w:t xml:space="preserve">Dữ liệu phiếu bị sửa ngoài phần mềm sau khi ký (bình thường phần mềm không cho sửa phiếu đã ký)</w:t>
             </w:r>
           </w:p>
         </w:tc>

</xml_diff>